<commit_message>
Run the delivery jobs in-process instead of on external cron
Render bills cron jobs separately from the web service at a $1/month
minimum each, so two schedules would add cost for what amounts to a
curl every few minutes. The always-on web service now runs the loop
itself.

Running per-instance is safe because sends are claimed before they go
out, so two instances cannot both deliver the same notification. The
HTTP job endpoints stay for manual triggering, and ENABLE_SCHEDULER
turns the loop off if we ever move to a real scheduler.

Also refreshes the implementation notes, which described reminders and
the briefing as unimplemented.

Co-Authored-By: Claude Opus 5 <noreply@anthropic.com>
</commit_message>
<xml_diff>
--- a/docs/implementation-notes.docx
+++ b/docs/implementation-notes.docx
@@ -156,15 +156,15 @@
           <w:sz w:val="19"/>
           <w:szCs w:val="19"/>
         </w:rPr>
-        <w:t xml:space="preserve">朝のブリーフィングとリマインダーは、サーバー発の通知になっていません。</w:t>
-      </w:r>
-      <w:r>
-        <w:rPr>
-          <w:rFonts w:ascii="Yu Gothic" w:cs="Yu Gothic" w:eastAsia="Yu Gothic" w:hAnsi="Yu Gothic"/>
-          <w:sz w:val="19"/>
-          <w:szCs w:val="19"/>
-        </w:rPr>
-        <w:t xml:space="preserve">いずれもアプリを開いている間に動く仕組みです。仕様書が前提とする Cron ＋プッシュ通知は未実装です。</w:t>
+        <w:t xml:space="preserve">朝のブリーフィングとリマインダーは、サーバーからのプッシュ通知で届きます。</w:t>
+      </w:r>
+      <w:r>
+        <w:rPr>
+          <w:rFonts w:ascii="Yu Gothic" w:cs="Yu Gothic" w:eastAsia="Yu Gothic" w:hAnsi="Yu Gothic"/>
+          <w:sz w:val="19"/>
+          <w:szCs w:val="19"/>
+        </w:rPr>
+        <w:t xml:space="preserve">仕様書は Cron サービスを前提にしていましたが、外部Cronは別課金になるため、常時起動しているバックエンド内で5分おきに判定する方式にしています。iPhone は「ホーム画面に追加」が受信条件です。</w:t>
       </w:r>
     </w:p>
     <w:p>
@@ -2621,6 +2621,228 @@
           </w:p>
         </w:tc>
       </w:tr>
+      <w:tr>
+        <w:tc>
+          <w:tcPr>
+            <w:tcW w:type="dxa" w:w="2300"/>
+            <w:tcMar>
+              <w:top w:type="dxa" w:w="90"/>
+              <w:left w:type="dxa" w:w="110"/>
+              <w:bottom w:type="dxa" w:w="90"/>
+              <w:right w:type="dxa" w:w="110"/>
+            </w:tcMar>
+          </w:tcPr>
+          <w:p>
+            <w:pPr>
+              <w:spacing w:after="120" w:line="300"/>
+            </w:pPr>
+            <w:r>
+              <w:rPr>
+                <w:rFonts w:ascii="Consolas" w:cs="Consolas" w:eastAsia="Consolas" w:hAnsi="Consolas"/>
+                <w:sz w:val="18"/>
+                <w:szCs w:val="18"/>
+              </w:rPr>
+              <w:t xml:space="preserve">user_settings</w:t>
+            </w:r>
+          </w:p>
+        </w:tc>
+        <w:tc>
+          <w:tcPr>
+            <w:tcW w:type="dxa" w:w="1200"/>
+            <w:tcMar>
+              <w:top w:type="dxa" w:w="90"/>
+              <w:left w:type="dxa" w:w="110"/>
+              <w:bottom w:type="dxa" w:w="90"/>
+              <w:right w:type="dxa" w:w="110"/>
+            </w:tcMar>
+          </w:tcPr>
+          <w:p>
+            <w:pPr>
+              <w:spacing w:after="120" w:line="300"/>
+            </w:pPr>
+            <w:r>
+              <w:rPr>
+                <w:rFonts w:ascii="Yu Gothic" w:cs="Yu Gothic" w:eastAsia="Yu Gothic" w:hAnsi="Yu Gothic"/>
+                <w:sz w:val="19"/>
+                <w:szCs w:val="19"/>
+              </w:rPr>
+              <w:t xml:space="preserve">追加</w:t>
+            </w:r>
+          </w:p>
+        </w:tc>
+        <w:tc>
+          <w:tcPr>
+            <w:tcW w:type="dxa" w:w="5526"/>
+            <w:tcMar>
+              <w:top w:type="dxa" w:w="90"/>
+              <w:left w:type="dxa" w:w="110"/>
+              <w:bottom w:type="dxa" w:w="90"/>
+              <w:right w:type="dxa" w:w="110"/>
+            </w:tcMar>
+          </w:tcPr>
+          <w:p>
+            <w:pPr>
+              <w:spacing w:after="120" w:line="300"/>
+            </w:pPr>
+            <w:r>
+              <w:rPr>
+                <w:rFonts w:ascii="Yu Gothic" w:cs="Yu Gothic" w:eastAsia="Yu Gothic" w:hAnsi="Yu Gothic"/>
+                <w:sz w:val="19"/>
+                <w:szCs w:val="19"/>
+              </w:rPr>
+              <w:t xml:space="preserve">通知設定。配信ジョブがサーバー側で判断するため端末のlocalStorageだけでは足りない</w:t>
+            </w:r>
+          </w:p>
+        </w:tc>
+      </w:tr>
+      <w:tr>
+        <w:tc>
+          <w:tcPr>
+            <w:tcW w:type="dxa" w:w="2300"/>
+            <w:tcMar>
+              <w:top w:type="dxa" w:w="90"/>
+              <w:left w:type="dxa" w:w="110"/>
+              <w:bottom w:type="dxa" w:w="90"/>
+              <w:right w:type="dxa" w:w="110"/>
+            </w:tcMar>
+          </w:tcPr>
+          <w:p>
+            <w:pPr>
+              <w:spacing w:after="120" w:line="300"/>
+            </w:pPr>
+            <w:r>
+              <w:rPr>
+                <w:rFonts w:ascii="Consolas" w:cs="Consolas" w:eastAsia="Consolas" w:hAnsi="Consolas"/>
+                <w:sz w:val="18"/>
+                <w:szCs w:val="18"/>
+              </w:rPr>
+              <w:t xml:space="preserve">push_subscriptions</w:t>
+            </w:r>
+          </w:p>
+        </w:tc>
+        <w:tc>
+          <w:tcPr>
+            <w:tcW w:type="dxa" w:w="1200"/>
+            <w:tcMar>
+              <w:top w:type="dxa" w:w="90"/>
+              <w:left w:type="dxa" w:w="110"/>
+              <w:bottom w:type="dxa" w:w="90"/>
+              <w:right w:type="dxa" w:w="110"/>
+            </w:tcMar>
+          </w:tcPr>
+          <w:p>
+            <w:pPr>
+              <w:spacing w:after="120" w:line="300"/>
+            </w:pPr>
+            <w:r>
+              <w:rPr>
+                <w:rFonts w:ascii="Yu Gothic" w:cs="Yu Gothic" w:eastAsia="Yu Gothic" w:hAnsi="Yu Gothic"/>
+                <w:sz w:val="19"/>
+                <w:szCs w:val="19"/>
+              </w:rPr>
+              <w:t xml:space="preserve">追加</w:t>
+            </w:r>
+          </w:p>
+        </w:tc>
+        <w:tc>
+          <w:tcPr>
+            <w:tcW w:type="dxa" w:w="5526"/>
+            <w:tcMar>
+              <w:top w:type="dxa" w:w="90"/>
+              <w:left w:type="dxa" w:w="110"/>
+              <w:bottom w:type="dxa" w:w="90"/>
+              <w:right w:type="dxa" w:w="110"/>
+            </w:tcMar>
+          </w:tcPr>
+          <w:p>
+            <w:pPr>
+              <w:spacing w:after="120" w:line="300"/>
+            </w:pPr>
+            <w:r>
+              <w:rPr>
+                <w:rFonts w:ascii="Yu Gothic" w:cs="Yu Gothic" w:eastAsia="Yu Gothic" w:hAnsi="Yu Gothic"/>
+                <w:sz w:val="19"/>
+                <w:szCs w:val="19"/>
+              </w:rPr>
+              <w:t xml:space="preserve">プッシュ通知の宛先。1ユーザーが複数端末を持てる</w:t>
+            </w:r>
+          </w:p>
+        </w:tc>
+      </w:tr>
+      <w:tr>
+        <w:tc>
+          <w:tcPr>
+            <w:tcW w:type="dxa" w:w="2300"/>
+            <w:tcMar>
+              <w:top w:type="dxa" w:w="90"/>
+              <w:left w:type="dxa" w:w="110"/>
+              <w:bottom w:type="dxa" w:w="90"/>
+              <w:right w:type="dxa" w:w="110"/>
+            </w:tcMar>
+          </w:tcPr>
+          <w:p>
+            <w:pPr>
+              <w:spacing w:after="120" w:line="300"/>
+            </w:pPr>
+            <w:r>
+              <w:rPr>
+                <w:rFonts w:ascii="Consolas" w:cs="Consolas" w:eastAsia="Consolas" w:hAnsi="Consolas"/>
+                <w:sz w:val="18"/>
+                <w:szCs w:val="18"/>
+              </w:rPr>
+              <w:t xml:space="preserve">sent_notifications</w:t>
+            </w:r>
+          </w:p>
+        </w:tc>
+        <w:tc>
+          <w:tcPr>
+            <w:tcW w:type="dxa" w:w="1200"/>
+            <w:tcMar>
+              <w:top w:type="dxa" w:w="90"/>
+              <w:left w:type="dxa" w:w="110"/>
+              <w:bottom w:type="dxa" w:w="90"/>
+              <w:right w:type="dxa" w:w="110"/>
+            </w:tcMar>
+          </w:tcPr>
+          <w:p>
+            <w:pPr>
+              <w:spacing w:after="120" w:line="300"/>
+            </w:pPr>
+            <w:r>
+              <w:rPr>
+                <w:rFonts w:ascii="Yu Gothic" w:cs="Yu Gothic" w:eastAsia="Yu Gothic" w:hAnsi="Yu Gothic"/>
+                <w:sz w:val="19"/>
+                <w:szCs w:val="19"/>
+              </w:rPr>
+              <w:t xml:space="preserve">追加</w:t>
+            </w:r>
+          </w:p>
+        </w:tc>
+        <w:tc>
+          <w:tcPr>
+            <w:tcW w:type="dxa" w:w="5526"/>
+            <w:tcMar>
+              <w:top w:type="dxa" w:w="90"/>
+              <w:left w:type="dxa" w:w="110"/>
+              <w:bottom w:type="dxa" w:w="90"/>
+              <w:right w:type="dxa" w:w="110"/>
+            </w:tcMar>
+          </w:tcPr>
+          <w:p>
+            <w:pPr>
+              <w:spacing w:after="120" w:line="300"/>
+            </w:pPr>
+            <w:r>
+              <w:rPr>
+                <w:rFonts w:ascii="Yu Gothic" w:cs="Yu Gothic" w:eastAsia="Yu Gothic" w:hAnsi="Yu Gothic"/>
+                <w:sz w:val="19"/>
+                <w:szCs w:val="19"/>
+              </w:rPr>
+              <w:t xml:space="preserve">二重送信の防止記録。送信前に予約を入れ、重複したら送らない</w:t>
+            </w:r>
+          </w:p>
+        </w:tc>
+      </w:tr>
     </w:tbl>
     <w:p>
       <w:pPr>
@@ -3115,28 +3337,20 @@
             <w:r>
               <w:rPr>
                 <w:rFonts w:ascii="Yu Gothic" w:cs="Yu Gothic" w:eastAsia="Yu Gothic" w:hAnsi="Yu Gothic"/>
-                <w:sz w:val="19"/>
-                <w:szCs w:val="19"/>
-              </w:rPr>
-              <w:t xml:space="preserve">データを返す GET /api/briefing はありますが、</w:t>
-            </w:r>
-            <w:r>
-              <w:rPr>
-                <w:rFonts w:ascii="Yu Gothic" w:cs="Yu Gothic" w:eastAsia="Yu Gothic" w:hAnsi="Yu Gothic"/>
                 <w:b/>
                 <w:bCs/>
                 <w:sz w:val="19"/>
                 <w:szCs w:val="19"/>
               </w:rPr>
-              <w:t xml:space="preserve">Cron もプッシュ通知もありません</w:t>
-            </w:r>
-            <w:r>
-              <w:rPr>
-                <w:rFonts w:ascii="Yu Gothic" w:cs="Yu Gothic" w:eastAsia="Yu Gothic" w:hAnsi="Yu Gothic"/>
-                <w:sz w:val="19"/>
-                <w:szCs w:val="19"/>
-              </w:rPr>
-              <w:t xml:space="preserve">。アプリを開いたときに当日分を表示するだけです</w:t>
+              <w:t xml:space="preserve">実装済み。</w:t>
+            </w:r>
+            <w:r>
+              <w:rPr>
+                <w:rFonts w:ascii="Yu Gothic" w:cs="Yu Gothic" w:eastAsia="Yu Gothic" w:hAnsi="Yu Gothic"/>
+                <w:sz w:val="19"/>
+                <w:szCs w:val="19"/>
+              </w:rPr>
+              <w:t xml:space="preserve">ただし Cron サービスは使わず、常時起動しているバックエンド内で5分おきに判定しています（外部Cronは1本あたり月$1の別課金になるため）</w:t>
             </w:r>
           </w:p>
         </w:tc>
@@ -3208,10 +3422,20 @@
             <w:r>
               <w:rPr>
                 <w:rFonts w:ascii="Yu Gothic" w:cs="Yu Gothic" w:eastAsia="Yu Gothic" w:hAnsi="Yu Gothic"/>
-                <w:sz w:val="19"/>
-                <w:szCs w:val="19"/>
-              </w:rPr>
-              <w:t xml:space="preserve">アプリを開いている間だけ20秒ごとに判定して表示します。閉じている間は鳴りません。代わりに、リマインダーON中は画面が自動消灯しないようにしています</w:t>
+                <w:b/>
+                <w:bCs/>
+                <w:sz w:val="19"/>
+                <w:szCs w:val="19"/>
+              </w:rPr>
+              <w:t xml:space="preserve">実装済み。</w:t>
+            </w:r>
+            <w:r>
+              <w:rPr>
+                <w:rFonts w:ascii="Yu Gothic" w:cs="Yu Gothic" w:eastAsia="Yu Gothic" w:hAnsi="Yu Gothic"/>
+                <w:sz w:val="19"/>
+                <w:szCs w:val="19"/>
+              </w:rPr>
+              <w:t xml:space="preserve">アプリを閉じていても Web Push で届きます。iPhone は iOS 16.4 以降かつ「ホーム画面に追加」した状態が条件です</w:t>
             </w:r>
           </w:p>
         </w:tc>
@@ -4488,6 +4712,280 @@
                 <w:sz w:val="18"/>
                 <w:szCs w:val="18"/>
               </w:rPr>
+              <w:t xml:space="preserve">GET /api/push/public-key</w:t>
+            </w:r>
+          </w:p>
+          <w:p>
+            <w:pPr>
+              <w:spacing w:after="120" w:line="300"/>
+            </w:pPr>
+            <w:r>
+              <w:rPr>
+                <w:rFonts w:ascii="Consolas" w:cs="Consolas" w:eastAsia="Consolas" w:hAnsi="Consolas"/>
+                <w:sz w:val="18"/>
+                <w:szCs w:val="18"/>
+              </w:rPr>
+              <w:t xml:space="preserve">POST /api/push/subscribe</w:t>
+            </w:r>
+          </w:p>
+          <w:p>
+            <w:pPr>
+              <w:spacing w:after="120" w:line="300"/>
+            </w:pPr>
+            <w:r>
+              <w:rPr>
+                <w:rFonts w:ascii="Consolas" w:cs="Consolas" w:eastAsia="Consolas" w:hAnsi="Consolas"/>
+                <w:sz w:val="18"/>
+                <w:szCs w:val="18"/>
+              </w:rPr>
+              <w:t xml:space="preserve">POST /api/push/test</w:t>
+            </w:r>
+          </w:p>
+        </w:tc>
+        <w:tc>
+          <w:tcPr>
+            <w:tcW w:type="dxa" w:w="1200"/>
+            <w:tcMar>
+              <w:top w:type="dxa" w:w="90"/>
+              <w:left w:type="dxa" w:w="110"/>
+              <w:bottom w:type="dxa" w:w="90"/>
+              <w:right w:type="dxa" w:w="110"/>
+            </w:tcMar>
+          </w:tcPr>
+          <w:p>
+            <w:pPr>
+              <w:spacing w:after="120" w:line="300"/>
+            </w:pPr>
+            <w:r>
+              <w:rPr>
+                <w:rFonts w:ascii="Yu Gothic" w:cs="Yu Gothic" w:eastAsia="Yu Gothic" w:hAnsi="Yu Gothic"/>
+                <w:sz w:val="19"/>
+                <w:szCs w:val="19"/>
+              </w:rPr>
+              <w:t xml:space="preserve">追加</w:t>
+            </w:r>
+          </w:p>
+        </w:tc>
+        <w:tc>
+          <w:tcPr>
+            <w:tcW w:type="dxa" w:w="5526"/>
+            <w:tcMar>
+              <w:top w:type="dxa" w:w="90"/>
+              <w:left w:type="dxa" w:w="110"/>
+              <w:bottom w:type="dxa" w:w="90"/>
+              <w:right w:type="dxa" w:w="110"/>
+            </w:tcMar>
+          </w:tcPr>
+          <w:p>
+            <w:pPr>
+              <w:spacing w:after="120" w:line="300"/>
+            </w:pPr>
+            <w:r>
+              <w:rPr>
+                <w:rFonts w:ascii="Yu Gothic" w:cs="Yu Gothic" w:eastAsia="Yu Gothic" w:hAnsi="Yu Gothic"/>
+                <w:sz w:val="19"/>
+                <w:szCs w:val="19"/>
+              </w:rPr>
+              <w:t xml:space="preserve">プッシュ通知の購読管理と到達テスト</w:t>
+            </w:r>
+          </w:p>
+        </w:tc>
+      </w:tr>
+      <w:tr>
+        <w:tc>
+          <w:tcPr>
+            <w:tcW w:type="dxa" w:w="2300"/>
+            <w:tcMar>
+              <w:top w:type="dxa" w:w="90"/>
+              <w:left w:type="dxa" w:w="110"/>
+              <w:bottom w:type="dxa" w:w="90"/>
+              <w:right w:type="dxa" w:w="110"/>
+            </w:tcMar>
+          </w:tcPr>
+          <w:p>
+            <w:pPr>
+              <w:spacing w:after="120" w:line="300"/>
+            </w:pPr>
+            <w:r>
+              <w:rPr>
+                <w:rFonts w:ascii="Consolas" w:cs="Consolas" w:eastAsia="Consolas" w:hAnsi="Consolas"/>
+                <w:sz w:val="18"/>
+                <w:szCs w:val="18"/>
+              </w:rPr>
+              <w:t xml:space="preserve">GET /api/settings</w:t>
+            </w:r>
+          </w:p>
+          <w:p>
+            <w:pPr>
+              <w:spacing w:after="120" w:line="300"/>
+            </w:pPr>
+            <w:r>
+              <w:rPr>
+                <w:rFonts w:ascii="Consolas" w:cs="Consolas" w:eastAsia="Consolas" w:hAnsi="Consolas"/>
+                <w:sz w:val="18"/>
+                <w:szCs w:val="18"/>
+              </w:rPr>
+              <w:t xml:space="preserve">PUT /api/settings</w:t>
+            </w:r>
+          </w:p>
+        </w:tc>
+        <w:tc>
+          <w:tcPr>
+            <w:tcW w:type="dxa" w:w="1200"/>
+            <w:tcMar>
+              <w:top w:type="dxa" w:w="90"/>
+              <w:left w:type="dxa" w:w="110"/>
+              <w:bottom w:type="dxa" w:w="90"/>
+              <w:right w:type="dxa" w:w="110"/>
+            </w:tcMar>
+          </w:tcPr>
+          <w:p>
+            <w:pPr>
+              <w:spacing w:after="120" w:line="300"/>
+            </w:pPr>
+            <w:r>
+              <w:rPr>
+                <w:rFonts w:ascii="Yu Gothic" w:cs="Yu Gothic" w:eastAsia="Yu Gothic" w:hAnsi="Yu Gothic"/>
+                <w:sz w:val="19"/>
+                <w:szCs w:val="19"/>
+              </w:rPr>
+              <w:t xml:space="preserve">追加</w:t>
+            </w:r>
+          </w:p>
+        </w:tc>
+        <w:tc>
+          <w:tcPr>
+            <w:tcW w:type="dxa" w:w="5526"/>
+            <w:tcMar>
+              <w:top w:type="dxa" w:w="90"/>
+              <w:left w:type="dxa" w:w="110"/>
+              <w:bottom w:type="dxa" w:w="90"/>
+              <w:right w:type="dxa" w:w="110"/>
+            </w:tcMar>
+          </w:tcPr>
+          <w:p>
+            <w:pPr>
+              <w:spacing w:after="120" w:line="300"/>
+            </w:pPr>
+            <w:r>
+              <w:rPr>
+                <w:rFonts w:ascii="Yu Gothic" w:cs="Yu Gothic" w:eastAsia="Yu Gothic" w:hAnsi="Yu Gothic"/>
+                <w:sz w:val="19"/>
+                <w:szCs w:val="19"/>
+              </w:rPr>
+              <w:t xml:space="preserve">通知設定。配信ジョブが参照するためDBにも保持する</w:t>
+            </w:r>
+          </w:p>
+        </w:tc>
+      </w:tr>
+      <w:tr>
+        <w:tc>
+          <w:tcPr>
+            <w:tcW w:type="dxa" w:w="2300"/>
+            <w:tcMar>
+              <w:top w:type="dxa" w:w="90"/>
+              <w:left w:type="dxa" w:w="110"/>
+              <w:bottom w:type="dxa" w:w="90"/>
+              <w:right w:type="dxa" w:w="110"/>
+            </w:tcMar>
+          </w:tcPr>
+          <w:p>
+            <w:pPr>
+              <w:spacing w:after="120" w:line="300"/>
+            </w:pPr>
+            <w:r>
+              <w:rPr>
+                <w:rFonts w:ascii="Consolas" w:cs="Consolas" w:eastAsia="Consolas" w:hAnsi="Consolas"/>
+                <w:sz w:val="18"/>
+                <w:szCs w:val="18"/>
+              </w:rPr>
+              <w:t xml:space="preserve">POST /api/jobs/reminders</w:t>
+            </w:r>
+          </w:p>
+          <w:p>
+            <w:pPr>
+              <w:spacing w:after="120" w:line="300"/>
+            </w:pPr>
+            <w:r>
+              <w:rPr>
+                <w:rFonts w:ascii="Consolas" w:cs="Consolas" w:eastAsia="Consolas" w:hAnsi="Consolas"/>
+                <w:sz w:val="18"/>
+                <w:szCs w:val="18"/>
+              </w:rPr>
+              <w:t xml:space="preserve">POST /api/jobs/briefing</w:t>
+            </w:r>
+          </w:p>
+        </w:tc>
+        <w:tc>
+          <w:tcPr>
+            <w:tcW w:type="dxa" w:w="1200"/>
+            <w:tcMar>
+              <w:top w:type="dxa" w:w="90"/>
+              <w:left w:type="dxa" w:w="110"/>
+              <w:bottom w:type="dxa" w:w="90"/>
+              <w:right w:type="dxa" w:w="110"/>
+            </w:tcMar>
+          </w:tcPr>
+          <w:p>
+            <w:pPr>
+              <w:spacing w:after="120" w:line="300"/>
+            </w:pPr>
+            <w:r>
+              <w:rPr>
+                <w:rFonts w:ascii="Yu Gothic" w:cs="Yu Gothic" w:eastAsia="Yu Gothic" w:hAnsi="Yu Gothic"/>
+                <w:sz w:val="19"/>
+                <w:szCs w:val="19"/>
+              </w:rPr>
+              <w:t xml:space="preserve">追加</w:t>
+            </w:r>
+          </w:p>
+        </w:tc>
+        <w:tc>
+          <w:tcPr>
+            <w:tcW w:type="dxa" w:w="5526"/>
+            <w:tcMar>
+              <w:top w:type="dxa" w:w="90"/>
+              <w:left w:type="dxa" w:w="110"/>
+              <w:bottom w:type="dxa" w:w="90"/>
+              <w:right w:type="dxa" w:w="110"/>
+            </w:tcMar>
+          </w:tcPr>
+          <w:p>
+            <w:pPr>
+              <w:spacing w:after="120" w:line="300"/>
+            </w:pPr>
+            <w:r>
+              <w:rPr>
+                <w:rFonts w:ascii="Yu Gothic" w:cs="Yu Gothic" w:eastAsia="Yu Gothic" w:hAnsi="Yu Gothic"/>
+                <w:sz w:val="19"/>
+                <w:szCs w:val="19"/>
+              </w:rPr>
+              <w:t xml:space="preserve">配信ジョブの手動起動。共有シークレット必須。通常はアプリ内ループが回すため任意</w:t>
+            </w:r>
+          </w:p>
+        </w:tc>
+      </w:tr>
+      <w:tr>
+        <w:tc>
+          <w:tcPr>
+            <w:tcW w:type="dxa" w:w="2300"/>
+            <w:tcMar>
+              <w:top w:type="dxa" w:w="90"/>
+              <w:left w:type="dxa" w:w="110"/>
+              <w:bottom w:type="dxa" w:w="90"/>
+              <w:right w:type="dxa" w:w="110"/>
+            </w:tcMar>
+          </w:tcPr>
+          <w:p>
+            <w:pPr>
+              <w:spacing w:after="120" w:line="300"/>
+            </w:pPr>
+            <w:r>
+              <w:rPr>
+                <w:rFonts w:ascii="Consolas" w:cs="Consolas" w:eastAsia="Consolas" w:hAnsi="Consolas"/>
+                <w:sz w:val="18"/>
+                <w:szCs w:val="18"/>
+              </w:rPr>
               <w:t xml:space="preserve">POST /api/voice</w:t>
             </w:r>
           </w:p>
@@ -4712,7 +5210,63 @@
           <w:sz w:val="19"/>
           <w:szCs w:val="19"/>
         </w:rPr>
-        <w:t xml:space="preserve">— users／user_identities／oauth_tokens の3テーブルが未記載です</w:t>
+        <w:t xml:space="preserve">— users／user_identities／oauth_tokens／user_settings／push_subscriptions／sent_notifications の6テーブルが未記載です</w:t>
+      </w:r>
+    </w:p>
+    <w:p>
+      <w:pPr>
+        <w:pStyle w:val="ListParagraph"/>
+        <w:numPr>
+          <w:ilvl w:val="0"/>
+          <w:numId w:val="5"/>
+        </w:numPr>
+        <w:spacing w:after="100" w:line="300"/>
+      </w:pPr>
+      <w:r>
+        <w:rPr>
+          <w:rFonts w:ascii="Yu Gothic" w:cs="Yu Gothic" w:eastAsia="Yu Gothic" w:hAnsi="Yu Gothic"/>
+          <w:b/>
+          <w:bCs/>
+          <w:sz w:val="19"/>
+          <w:szCs w:val="19"/>
+        </w:rPr>
+        <w:t xml:space="preserve">§8 オフライン対応</w:t>
+      </w:r>
+      <w:r>
+        <w:rPr>
+          <w:rFonts w:ascii="Yu Gothic" w:cs="Yu Gothic" w:eastAsia="Yu Gothic" w:hAnsi="Yu Gothic"/>
+          <w:sz w:val="19"/>
+          <w:szCs w:val="19"/>
+        </w:rPr>
+        <w:t xml:space="preserve">— 「15〜30分ごとのバックグラウンド同期」は Periodic Background Sync API が前提だが、これは iOS に存在しない。iPhoneでは原理的に実現できない要件のため書き換えが必要</w:t>
+      </w:r>
+    </w:p>
+    <w:p>
+      <w:pPr>
+        <w:pStyle w:val="ListParagraph"/>
+        <w:numPr>
+          <w:ilvl w:val="0"/>
+          <w:numId w:val="5"/>
+        </w:numPr>
+        <w:spacing w:after="100" w:line="300"/>
+      </w:pPr>
+      <w:r>
+        <w:rPr>
+          <w:rFonts w:ascii="Yu Gothic" w:cs="Yu Gothic" w:eastAsia="Yu Gothic" w:hAnsi="Yu Gothic"/>
+          <w:b/>
+          <w:bCs/>
+          <w:sz w:val="19"/>
+          <w:szCs w:val="19"/>
+        </w:rPr>
+        <w:t xml:space="preserve">UC-1 / UC-7 の配信方式</w:t>
+      </w:r>
+      <w:r>
+        <w:rPr>
+          <w:rFonts w:ascii="Yu Gothic" w:cs="Yu Gothic" w:eastAsia="Yu Gothic" w:hAnsi="Yu Gothic"/>
+          <w:sz w:val="19"/>
+          <w:szCs w:val="19"/>
+        </w:rPr>
+        <w:t xml:space="preserve">— Cron サービス前提の記述を、アプリ内ループ＋Web Push の現行方式に改める。iOSでは「ホーム画面に追加」が受信条件である点も明記したい</w:t>
       </w:r>
     </w:p>
     <w:p>

</xml_diff>